<commit_message>
Revision 6b: WP_draft document for Christian (MOSTRAR exhibits in the text, APOYO in the appendix, no reading guide); review keeps only the renumbering plus two verified text fixes (China carriers GBR/LIE/PAN/CAN; DEU/JPN/NLD 27-45 % to Brazil)
Co-Authored-By: Claude Fable 5.1 <noreply@anthropic.com>
</commit_message>
<xml_diff>
--- a/docs/WP_revision_interna_2026-09-18.docx
+++ b/docs/WP_revision_interna_2026-09-18.docx
@@ -410,7 +410,7 @@
         <w:rPr>
           <w:lang w:val="es-CO"/>
         </w:rPr>
-        <w:t>Su peso en las exportaciones totales de cada país es muy desigual: Costa Rica 30 %, Paraguay 30 %, El Salvador 28 %, República Dominicana 17 %, Colombia 12 %, Argentina 8 %, Perú 8 %, Uruguay 5 %, Chile 3 % (Figura 2). Por sector: manufactura de Costa Rica 42 %, El Salvador 35 %, República Dominicana 26 %; agricultura de Paraguay 35 %; minería de Colombia 14 % y Perú 11 %. Por origen y sector: Figura 4 y Tabla 1.</w:t>
+        <w:t>Su peso en las exportaciones totales de cada país es muy desigual: Costa Rica 30 %, Paraguay 30 %, El Salvador 28 %, República Dominicana 17 %, Colombia 12 %, Argentina 8 %, Perú 8 %, Uruguay 5 %, Chile 3 % (Figura 2). Por sector: manufactura de Costa Rica 42 %, El Salvador 35 %, República Dominicana 26 %; agricultura de Paraguay 35 %; minería de Colombia 14 % y Perú 11 %.</w:t>
       </w:r>
     </w:p>
     <w:p>
@@ -474,7 +474,7 @@
         <w:rPr>
           <w:lang w:val="es-CO"/>
         </w:rPr>
-        <w:t>). Los productos concretos: camisetas de algodón (US$ 5,9 mm; las MNE de EE. UU. mueven 52 % de lo que ALC exporta de ese producto a EE. UU.), catéteres y cánulas (US$ 5,1 mm; 83 %), instrumentos médicos (US$ 3,6 mm; 43 %), circuitos integrados (US$ 2,1 mm; 95 %), neumáticos (US$ 1,8 mm; 63 %), ropa interior y medias (más de 85 %). (Tabla 21 y Figura 23.)</w:t>
+        <w:t>). Los productos concretos: camisetas de algodón (US$ 5,9 mm; las MNE de EE. UU. mueven 52 % de lo que ALC exporta de ese producto a EE. UU.), catéteres y cánulas (US$ 5,1 mm; 83 %), instrumentos médicos (US$ 3,6 mm; 43 %), circuitos integrados (US$ 2,1 mm; 95 %), neumáticos (US$ 1,8 mm; 63 %), ropa interior y medias (más de 85 %).</w:t>
       </w:r>
     </w:p>
     <w:p>
@@ -518,27 +518,27 @@
         <w:rPr>
           <w:lang w:val="es-CO"/>
         </w:rPr>
-        <w:t xml:space="preserve"> que tenemos. (Figura 21 y Tablas 18–19.)</w:t>
-      </w:r>
-    </w:p>
-    <w:p>
-      <w:pPr>
-        <w:pStyle w:val="ListParagraph"/>
-        <w:numPr>
-          <w:ilvl w:val="0"/>
-          <w:numId w:val="2"/>
-        </w:numPr>
-        <w:spacing w:before="80"/>
-        <w:jc w:val="both"/>
-        <w:rPr>
-          <w:lang w:val="es-CO"/>
-        </w:rPr>
-      </w:pPr>
-      <w:r>
-        <w:rPr>
-          <w:lang w:val="es-CO"/>
-        </w:rPr>
-        <w:t>El contraste sirve también para el resto de la historia: de los US$ 332 mm que ALC exporta a China, el 44 % lo mueven MNE extranjeras no estadounidenses (GBR, LIE, PAN, AUS: mineras) y las MNE con matriz china el 0,3 %. China compra a través de multinacionales occidentales, no de las propias. Hacia la UE-27, las MNE con matriz europea mueven 8 % y las de EE. UU. otro 9 %. (Figura 22 y Tabla 20.)</w:t>
+        <w:t xml:space="preserve"> que tenemos.</w:t>
+      </w:r>
+    </w:p>
+    <w:p>
+      <w:pPr>
+        <w:pStyle w:val="ListParagraph"/>
+        <w:numPr>
+          <w:ilvl w:val="0"/>
+          <w:numId w:val="2"/>
+        </w:numPr>
+        <w:spacing w:before="80"/>
+        <w:jc w:val="both"/>
+        <w:rPr>
+          <w:lang w:val="es-CO"/>
+        </w:rPr>
+      </w:pPr>
+      <w:r>
+        <w:rPr>
+          <w:lang w:val="es-CO"/>
+        </w:rPr>
+        <w:t>El contraste sirve también para el resto de la historia: de los US$ 332 mm que ALC exporta a China, el 44 % lo mueven MNE extranjeras no estadounidenses (GBR, LIE, PAN, CAN: minerales de cobre y hierro, cátodos de cobre y celulosa) y las MNE con matriz china el 0,3 %. China compra a través de multinacionales occidentales, no de las propias. Hacia la UE-27, las MNE con matriz europea mueven 8 % y las de EE. UU. otro 9 %.</w:t>
       </w:r>
     </w:p>
     <w:p>
@@ -590,7 +590,7 @@
         <w:rPr>
           <w:lang w:val="es-CO"/>
         </w:rPr>
-        <w:t xml:space="preserve">CAN/BRA: el hecho 3 no es solo "pocos países", sino "pocos países con estrategias distintas": GBR y LIE (cobre, carbón) venden 36 % y 25 % a China; DEU, JPN y NLD (autos, químicos) venden 32–45 % a Brasil desde Argentina (plataforma Mercosur); EE. UU. vende 22 % a EE. UU. </w:t>
+        <w:t xml:space="preserve">CAN/BRA: el hecho 3 no es solo "pocos países", sino "pocos países con estrategias distintas": GBR y LIE (cobre, carbón) venden 36 % y 25 % a China; DEU, JPN y NLD (autos, químicos) venden 27–45 % a Brasil desde Argentina (plataforma Mercosur); EE. UU. vende 22 % a EE. UU. </w:t>
       </w:r>
       <w:r>
         <w:rPr>
@@ -953,7 +953,7 @@
         <w:rPr>
           <w:lang w:val="es-CO"/>
         </w:rPr>
-        <w:t>. Figura 4 y Tabla 1.</w:t>
+        <w:t>.</w:t>
       </w:r>
     </w:p>
     <w:p>
@@ -1701,25 +1701,27 @@
           <w:bCs/>
           <w:lang w:val="es-CO"/>
         </w:rPr>
-        <w:t>Figura 19 (parte de las exportaciones de cada matriz que va a su propio país) — MOSTRAR. Figura clave: USA 22 %, CAN 20 %, BRA 19 %, ESP 12 %, JPN 9 %, DEU 8 %, NLD 2 %, GBR 1 %, LIE 0 %, CHE 0 %. Promedio 9 %. Con las versiones sectoriales (WP_sectors): manufactura USA 41 %, BRA 22 %, DEU 9 %, JPN 3 %; agricultura USA 7 %, ESP 26 %, JPN 33 % (cifras chicas); minería CAN 26 %, BRA 34 %, USA 12,5 %, GBR 0,6 %. Propongo una versión con las cuatro barras (total y tres sectores) por matriz. Es la Figura 20 (números en la Tabla 17)</w:t>
-      </w:r>
-      <w:r>
-        <w:rPr>
-          <w:lang w:val="es-CO"/>
-        </w:rPr>
+        <w:t xml:space="preserve">Figura 19 (parte de las exportaciones de cada matriz que va a su propio país) — MOSTRAR. </w:t>
+      </w:r>
+      <w:r>
+        <w:rPr>
+          <w:lang w:val="es-CO"/>
+        </w:rPr>
+        <w:t>Figura clave: USA 22 %, CAN 20 %, BRA 19 %, ESP 12 %, JPN 9 %, DEU 8 %, NLD 2 %, GBR 1 %, LIE 0 %, CHE 0 %. Promedio 9 %. Con las versiones sectoriales (</w:t>
       </w:r>
       <w:proofErr w:type="spellStart"/>
       <w:r>
         <w:rPr>
           <w:lang w:val="es-CO"/>
         </w:rPr>
+        <w:t>WP_sectors</w:t>
       </w:r>
       <w:proofErr w:type="spellEnd"/>
       <w:r>
         <w:rPr>
           <w:lang w:val="es-CO"/>
         </w:rPr>
-        <w:t>.</w:t>
+        <w:t>): manufactura USA 41 %, BRA 22 %, DEU 9 %, JPN 3 %; agricultura USA 7 %, ESP 26 %, JPN 33 % (cifras chicas); minería CAN 26 %, BRA 34 %, USA 12,5 %, GBR 0,6 %. Propongo una versión con las cuatro barras (total y tres sectores) por matriz.</w:t>
       </w:r>
     </w:p>
     <w:p>
@@ -1824,7 +1826,7 @@
         <w:rPr>
           <w:lang w:val="es-CO"/>
         </w:rPr>
-        <w:t>. Esta lista, junto con la tabla "quién mueve las exportaciones a EE. UU." Tabla 21 y Figura 23; Figura 21 y Tablas 18–19; Tabla 22 (las 15 líneas más grandes que ALC exporta a EE. UU., quién las mueve).</w:t>
+        <w:t xml:space="preserve">. Esta lista, junto con la tabla "quién mueve las exportaciones a EE. UU." </w:t>
       </w:r>
     </w:p>
     <w:p>
@@ -2122,20 +2124,21 @@
         <w:rPr>
           <w:lang w:val="es-CO"/>
         </w:rPr>
-        <w:t>La Tabla 29 sectorial se sostiene: agricultura 1,30 (extranjeras) vs 0,52 (domésticas) y sobre las locales 1,22 vs 0,57; manufactura 1,16 vs 0,38 y 1,05 vs 0,42; minería 1,13 vs 0,32 (n.s.), con la advertencia de que en minería la columna con efectos fijos completos pierde significancia y las columnas HQ quedan en blanco por falta de observaciones. Propongo una tabla resumen con las filas "extranjeras" y "domésticas" para total y tres sectores (cuatro columnas). Es la Tabla 31</w:t>
+        <w:t>La Tabla 29 sectorial se sostiene: agricultura 1,30 (extranjeras) vs 0,52 (domésticas) y sobre las locales 1,22 vs 0,57; manufactura 1,16 vs 0,38 y 1,05 vs 0,42; minería 1,13 vs 0,32 (</w:t>
       </w:r>
       <w:proofErr w:type="spellStart"/>
       <w:r>
         <w:rPr>
           <w:lang w:val="es-CO"/>
         </w:rPr>
+        <w:t>n.s.</w:t>
       </w:r>
       <w:proofErr w:type="spellEnd"/>
       <w:r>
         <w:rPr>
           <w:lang w:val="es-CO"/>
         </w:rPr>
-        <w:t>.</w:t>
+        <w:t>), con la advertencia de que en minería la columna con efectos fijos completos pierde significancia y las columnas HQ quedan en blanco por falta de observaciones. Propongo una tabla resumen con las filas "extranjeras" y "domésticas" para total y tres sectores (cuatro columnas).</w:t>
       </w:r>
     </w:p>
     <w:p>
@@ -2248,7 +2251,7 @@
         <w:rPr>
           <w:lang w:val="es-CO"/>
         </w:rPr>
-        <w:t xml:space="preserve"> la distancia no es una barrera y la única MNE doméstica grande (Ecopetrol) exporta lejos. Propongo la misma tabla resumen de cuatro columnas que para el hecho 5. Es la Tabla 34.</w:t>
+        <w:t xml:space="preserve"> la distancia no es una barrera y la única MNE doméstica grande (Ecopetrol) exporta lejos. Propongo la misma tabla resumen de cuatro columnas que para el hecho 5.</w:t>
       </w:r>
     </w:p>
     <w:p>
@@ -2596,7 +2599,7 @@
         <w:rPr>
           <w:lang w:val="es-CO"/>
         </w:rPr>
-        <w:t>Figura 15 / Tabla 8 (ranking de matrices) con la Tabla 13 (matriz × destino) y las Figuras 19–20 (parte exportada al país de la matriz, total y por sector).</w:t>
+        <w:t>Figura 15 / Tabla 8 (ranking de matrices) con la Tabla 13 (matriz × destino) y la Figura 19 (parte exportada al país de la matriz, total y por sector).</w:t>
       </w:r>
     </w:p>
     <w:p>
@@ -2631,7 +2634,7 @@
         <w:rPr>
           <w:lang w:val="es-CO"/>
         </w:rPr>
-        <w:t>rticipación de las MNE de EE. UU. en las exportaciones de cada país a EE. UU., total y manufactura (CRI 54 %, SLV 47 %, DOM 31 %), y la lista de productos que van a casa. Figura 21 y Tablas 18–19; Tabla 21 y Figura 23.</w:t>
+        <w:t>rticipación de las MNE de EE. UU. en las exportaciones de cada país a EE. UU., total y manufactura (CRI 54 %, SLV 47 %, DOM 31 %), y la lista de productos que van a casa.</w:t>
       </w:r>
     </w:p>
     <w:p>
@@ -2687,7 +2690,7 @@
         <w:rPr>
           <w:lang w:val="es-CO"/>
         </w:rPr>
-        <w:t>Tabla 27 y Tabla 29 (hecho 5 y su descomposición), más la tabla resumen sectorial de cuatro columnas. (Tabla 31.)</w:t>
+        <w:t>Tabla 27 y Tabla 29 (hecho 5 y su descomposición), más la tabla resumen sectorial de cuatro columnas.</w:t>
       </w:r>
     </w:p>
     <w:p>
@@ -2715,7 +2718,7 @@
         <w:rPr>
           <w:lang w:val="es-CO"/>
         </w:rPr>
-        <w:t>Tabla 32 y Tabla 33 (hecho 6 y su descomposición), más la misma tabla resumen sectorial. (Tabla 34.)</w:t>
+        <w:t>Tabla 32 y Tabla 33 (hecho 6 y su descomposición), más la misma tabla resumen sectorial.</w:t>
       </w:r>
     </w:p>
     <w:p>

</xml_diff>